<commit_message>
feat: add panel data loader and Excel styling utilities with updated report workbooks
</commit_message>
<xml_diff>
--- a/thesis_docs/manuscripts/ChpIV v2.docx
+++ b/thesis_docs/manuscripts/ChpIV v2.docx
@@ -2563,26 +2563,41 @@
         <w:t xml:space="preserve">Following conformed extraction, automated entity resolution, data cleaning, and </w:t>
       </w:r>
       <w:r>
-        <w:t xml:space="preserve">relational synthesis across standardized operational dimensions </w:t>
-      </w:r>
-      <w:commentRangeStart w:id="6"/>
-      <w:r>
-        <w:t xml:space="preserve">(calendar date, departure time block, </w:t>
-      </w:r>
-      <w:r>
+        <w:t>relational synthesis across standardized operational dimensions (</w:t>
+      </w:r>
+      <w:r>
+        <w:rPr>
+          <w:i/>
+          <w:iCs/>
+        </w:rPr>
+        <w:t xml:space="preserve">calendar date, departure time block, </w:t>
+      </w:r>
+      <w:r>
+        <w:rPr>
+          <w:i/>
+          <w:iCs/>
+        </w:rPr>
         <w:t>airport</w:t>
       </w:r>
       <w:r>
-        <w:t xml:space="preserve">, operating carrier, fleet aircraft type, and dedicated screening complex), </w:t>
-      </w:r>
-      <w:commentRangeEnd w:id="6"/>
-      <w:r>
-        <w:rPr>
-          <w:rStyle w:val="CommentReference"/>
-          <w:sz w:val="24"/>
-          <w:szCs w:val="24"/>
-        </w:rPr>
-        <w:commentReference w:id="6"/>
+        <w:rPr>
+          <w:i/>
+          <w:iCs/>
+        </w:rPr>
+        <w:t>, operating carrier, fleet aircraft type,</w:t>
+      </w:r>
+      <w:r>
+        <w:t xml:space="preserve"> and</w:t>
+      </w:r>
+      <w:r>
+        <w:rPr>
+          <w:i/>
+          <w:iCs/>
+        </w:rPr>
+        <w:t xml:space="preserve"> dedicated screening complex</w:t>
+      </w:r>
+      <w:r>
+        <w:t xml:space="preserve">), </w:t>
       </w:r>
       <w:r>
         <w:t xml:space="preserve">the nationwide post-ETL analytical warehouse retains 42,062,039 conformed records across the candidate network of the Top 25 U.S. commercial </w:t>
@@ -2658,7 +2673,7 @@
                     <pic:cNvPicPr/>
                   </pic:nvPicPr>
                   <pic:blipFill>
-                    <a:blip r:embed="rId11"/>
+                    <a:blip r:embed="rId7"/>
                     <a:stretch>
                       <a:fillRect/>
                     </a:stretch>
@@ -2727,7 +2742,7 @@
                     <pic:cNvPicPr/>
                   </pic:nvPicPr>
                   <pic:blipFill>
-                    <a:blip r:embed="rId12"/>
+                    <a:blip r:embed="rId8"/>
                     <a:stretch>
                       <a:fillRect/>
                     </a:stretch>
@@ -2766,13 +2781,13 @@
       <w:pPr>
         <w:pStyle w:val="Heading3"/>
       </w:pPr>
-      <w:bookmarkStart w:id="7" w:name="_Toc242174147"/>
-      <w:bookmarkStart w:id="8" w:name="_Toc242174799"/>
+      <w:bookmarkStart w:id="6" w:name="_Toc242174147"/>
+      <w:bookmarkStart w:id="7" w:name="_Toc242174799"/>
       <w:r>
         <w:t>Temporal Boundaries</w:t>
       </w:r>
+      <w:bookmarkEnd w:id="6"/>
       <w:bookmarkEnd w:id="7"/>
-      <w:bookmarkEnd w:id="8"/>
     </w:p>
     <w:p>
       <w:pPr>
@@ -2792,8 +2807,8 @@
         <w:ind w:firstLine="360"/>
         <w:contextualSpacing/>
       </w:pPr>
-      <w:bookmarkStart w:id="9" w:name="_Toc242174148"/>
-      <w:bookmarkStart w:id="10" w:name="_Toc242174800"/>
+      <w:bookmarkStart w:id="8" w:name="_Toc242174148"/>
+      <w:bookmarkStart w:id="9" w:name="_Toc242174800"/>
       <w:r>
         <w:rPr>
           <w:b/>
@@ -2801,8 +2816,8 @@
         </w:rPr>
         <w:t>Post-Pandemic Regime Selection and Structural Break Analysis</w:t>
       </w:r>
+      <w:bookmarkEnd w:id="8"/>
       <w:bookmarkEnd w:id="9"/>
-      <w:bookmarkEnd w:id="10"/>
       <w:r>
         <w:rPr>
           <w:b/>
@@ -2916,11 +2931,7 @@
       </w:r>
       <w:r>
         <w:lastRenderedPageBreak/>
-        <w:t xml:space="preserve">baseline. </w:t>
-      </w:r>
-      <w:commentRangeStart w:id="11"/>
-      <w:r>
-        <w:t>This development window was partitioned into a 20-month training window (May 1, 2022 – December 31, 2023), a 12-month validation window (January 1, 2024 – December 31, 2024), and an untouched 12-month out-of-time holdout test set (January 1, 2025 – December 31, 2025), separated by a 7-day operational purge buffer to prevent multi-day delay cascades from leaking across partition boundaries.</w:t>
+        <w:t>baseline. This development window was partitioned into a 20-month training window (May 1, 2022 – December 31, 2023), a 12-month validation window (January 1, 2024 – December 31, 2024), and an untouched 12-month out-of-time holdout test set (January 1, 2025 – December 31, 2025), separated by a 7-day operational purge buffer to prevent multi-day delay cascades from leaking across partition boundaries.</w:t>
       </w:r>
       <w:r>
         <w:rPr>
@@ -2929,27 +2940,18 @@
         </w:rPr>
         <w:t xml:space="preserve"> </w:t>
       </w:r>
-      <w:commentRangeEnd w:id="11"/>
-      <w:r>
-        <w:rPr>
-          <w:rStyle w:val="CommentReference"/>
-          <w:sz w:val="24"/>
-          <w:szCs w:val="24"/>
-        </w:rPr>
-        <w:commentReference w:id="11"/>
-      </w:r>
     </w:p>
     <w:p>
       <w:pPr>
         <w:pStyle w:val="Heading3"/>
       </w:pPr>
-      <w:bookmarkStart w:id="12" w:name="_Toc242174149"/>
-      <w:bookmarkStart w:id="13" w:name="_Toc242174801"/>
+      <w:bookmarkStart w:id="10" w:name="_Toc242174149"/>
+      <w:bookmarkStart w:id="11" w:name="_Toc242174801"/>
       <w:r>
         <w:t>Defining Seasonality</w:t>
       </w:r>
-      <w:bookmarkEnd w:id="12"/>
-      <w:bookmarkEnd w:id="13"/>
+      <w:bookmarkEnd w:id="10"/>
+      <w:bookmarkEnd w:id="11"/>
     </w:p>
     <w:p>
       <w:pPr>
@@ -2967,7 +2969,13 @@
         <w:t xml:space="preserve"> See appendix for </w:t>
       </w:r>
       <w:r>
-        <w:t xml:space="preserve">Seasonality Dimensions detail. It is important to define these for models to take into account so like for like is being compared. </w:t>
+        <w:t xml:space="preserve">Seasonality Dimensions detail. It is important to define these for models to </w:t>
+      </w:r>
+      <w:r>
+        <w:t>consider</w:t>
+      </w:r>
+      <w:r>
+        <w:t xml:space="preserve"> so like for like is being compared. </w:t>
       </w:r>
     </w:p>
     <w:p>
@@ -2980,8 +2988,8 @@
           <w:iCs/>
         </w:rPr>
       </w:pPr>
-      <w:bookmarkStart w:id="14" w:name="_Toc242174150"/>
-      <w:bookmarkStart w:id="15" w:name="_Toc242174802"/>
+      <w:bookmarkStart w:id="12" w:name="_Toc242174150"/>
+      <w:bookmarkStart w:id="13" w:name="_Toc242174802"/>
       <w:r>
         <w:rPr>
           <w:b/>
@@ -2991,8 +2999,8 @@
         </w:rPr>
         <w:t>TSA and OTP Throughput Data</w:t>
       </w:r>
-      <w:bookmarkEnd w:id="14"/>
-      <w:bookmarkEnd w:id="15"/>
+      <w:bookmarkEnd w:id="12"/>
+      <w:bookmarkEnd w:id="13"/>
     </w:p>
     <w:p>
       <w:pPr>
@@ -3079,13 +3087,7 @@
           <w:rPr>
             <w:rFonts w:ascii="Cambria Math" w:hAnsi="Cambria Math"/>
           </w:rPr>
-          <m:t>r=</m:t>
-        </m:r>
-        <m:r>
-          <w:rPr>
-            <w:rFonts w:ascii="Cambria Math" w:hAnsi="Cambria Math"/>
-          </w:rPr>
-          <m:t>0.6704,p&lt;0.001</m:t>
+          <m:t>r=0.6704,p&lt;0.001</m:t>
         </m:r>
       </m:oMath>
       <w:r>
@@ -3107,7 +3109,7 @@
         <w:ind w:firstLine="360"/>
         <w:contextualSpacing/>
       </w:pPr>
-      <w:commentRangeStart w:id="16"/>
+      <w:commentRangeStart w:id="14"/>
       <w:r>
         <w:rPr>
           <w:b/>
@@ -3115,14 +3117,14 @@
         </w:rPr>
         <w:t>Coupled Volatility and Asynchronous Lag Dynamics</w:t>
       </w:r>
-      <w:commentRangeEnd w:id="16"/>
+      <w:commentRangeEnd w:id="14"/>
       <w:r>
         <w:rPr>
           <w:rStyle w:val="CommentReference"/>
           <w:sz w:val="24"/>
           <w:szCs w:val="24"/>
         </w:rPr>
-        <w:commentReference w:id="16"/>
+        <w:commentReference w:id="14"/>
       </w:r>
       <w:r>
         <w:t>. While raw delay rates show weak same-hour linear correlation with passenger volumes (</w:t>
@@ -3333,10 +3335,7 @@
         <w:t>are not used as direct regression features</w:t>
       </w:r>
       <w:r>
-        <w:t>. Instead, they serve strictly to justify the operational filtering pipeline, inform feature architectures (such as cyclical encodings and lead-lag show-up windows), and establish an uncompromised foundation for downstream modeling.</w:t>
-      </w:r>
-      <w:r>
-        <w:t xml:space="preserve"> </w:t>
+        <w:t xml:space="preserve">. Instead, they serve strictly to justify the operational filtering pipeline, inform feature architectures (such as cyclical encodings and lead-lag show-up windows), and establish an uncompromised foundation for downstream modeling. </w:t>
       </w:r>
     </w:p>
     <w:p>
@@ -3374,25 +3373,25 @@
       <w:pPr>
         <w:pStyle w:val="Heading2"/>
       </w:pPr>
-      <w:bookmarkStart w:id="17" w:name="_Toc242174151"/>
-      <w:bookmarkStart w:id="18" w:name="_Toc242174803"/>
+      <w:bookmarkStart w:id="15" w:name="_Toc242174151"/>
+      <w:bookmarkStart w:id="16" w:name="_Toc242174803"/>
       <w:r>
         <w:t>Data Filtering and Subset Selection</w:t>
+      </w:r>
+      <w:bookmarkEnd w:id="15"/>
+      <w:bookmarkEnd w:id="16"/>
+    </w:p>
+    <w:p>
+      <w:pPr>
+        <w:pStyle w:val="Heading3"/>
+      </w:pPr>
+      <w:bookmarkStart w:id="17" w:name="_Toc242174152"/>
+      <w:bookmarkStart w:id="18" w:name="_Toc242174804"/>
+      <w:r>
+        <w:t>Four-Phase Filtering Pipeline</w:t>
       </w:r>
       <w:bookmarkEnd w:id="17"/>
       <w:bookmarkEnd w:id="18"/>
-    </w:p>
-    <w:p>
-      <w:pPr>
-        <w:pStyle w:val="Heading3"/>
-      </w:pPr>
-      <w:bookmarkStart w:id="19" w:name="_Toc242174152"/>
-      <w:bookmarkStart w:id="20" w:name="_Toc242174804"/>
-      <w:r>
-        <w:t>Four-Phase Filtering Pipeline</w:t>
-      </w:r>
-      <w:bookmarkEnd w:id="19"/>
-      <w:bookmarkEnd w:id="20"/>
     </w:p>
     <w:p>
       <w:pPr>
@@ -4592,7 +4591,7 @@
         </w:rPr>
         <w:t xml:space="preserve"> </w:t>
       </w:r>
-      <w:commentRangeStart w:id="21"/>
+      <w:commentRangeStart w:id="19"/>
       <w:r>
         <w:rPr>
           <w:color w:val="000000" w:themeColor="text1"/>
@@ -4605,7 +4604,7 @@
         </w:rPr>
         <w:t>on.</w:t>
       </w:r>
-      <w:commentRangeEnd w:id="21"/>
+      <w:commentRangeEnd w:id="19"/>
       <w:r>
         <w:rPr>
           <w:rStyle w:val="CommentReference"/>
@@ -4613,7 +4612,7 @@
           <w:sz w:val="24"/>
           <w:szCs w:val="24"/>
         </w:rPr>
-        <w:commentReference w:id="21"/>
+        <w:commentReference w:id="19"/>
       </w:r>
     </w:p>
     <w:p>
@@ -4644,18 +4643,18 @@
       <w:r>
         <w:t xml:space="preserve">All candidate architectures were evaluated against the untouched 2025 </w:t>
       </w:r>
-      <w:commentRangeStart w:id="22"/>
+      <w:commentRangeStart w:id="20"/>
       <w:r>
         <w:t>Full-Year Out-of-Time Holdout Dataset</w:t>
       </w:r>
-      <w:commentRangeEnd w:id="22"/>
+      <w:commentRangeEnd w:id="20"/>
       <w:r>
         <w:rPr>
           <w:rStyle w:val="CommentReference"/>
           <w:sz w:val="24"/>
           <w:szCs w:val="24"/>
         </w:rPr>
-        <w:commentReference w:id="22"/>
+        <w:commentReference w:id="20"/>
       </w:r>
       <w:r>
         <w:t>.</w:t>
@@ -4663,18 +4662,18 @@
       <w:r>
         <w:t xml:space="preserve"> Forecast performance was evaluated against the primary thesis target of </w:t>
       </w:r>
-      <w:commentRangeStart w:id="23"/>
+      <w:commentRangeStart w:id="21"/>
       <w:r>
         <w:t xml:space="preserve">diurnal </w:t>
       </w:r>
-      <w:commentRangeEnd w:id="23"/>
+      <w:commentRangeEnd w:id="21"/>
       <w:r>
         <w:rPr>
           <w:rStyle w:val="CommentReference"/>
           <w:sz w:val="24"/>
           <w:szCs w:val="24"/>
         </w:rPr>
-        <w:commentReference w:id="23"/>
+        <w:commentReference w:id="21"/>
       </w:r>
       <w:r>
         <w:t>throughput volatility (</w:t>
@@ -5027,13 +5026,13 @@
       <w:pPr>
         <w:pStyle w:val="Heading3"/>
       </w:pPr>
-      <w:bookmarkStart w:id="24" w:name="_Toc242174153"/>
-      <w:bookmarkStart w:id="25" w:name="_Toc242174805"/>
+      <w:bookmarkStart w:id="22" w:name="_Toc242174153"/>
+      <w:bookmarkStart w:id="23" w:name="_Toc242174805"/>
       <w:r>
         <w:t>General Model Performance Across the 9-Airport Cohort</w:t>
       </w:r>
-      <w:bookmarkEnd w:id="24"/>
-      <w:bookmarkEnd w:id="25"/>
+      <w:bookmarkEnd w:id="22"/>
+      <w:bookmarkEnd w:id="23"/>
     </w:p>
     <w:p>
       <w:pPr>
@@ -5287,10 +5286,7 @@
         <w:t xml:space="preserve"> </w:t>
       </w:r>
       <w:r>
-        <w:t>I</w:t>
-      </w:r>
-      <w:r>
-        <w:t>ncorporating live prior-hour error feedback yielded the highest overall holdout fit, explaining 74.83% of passenger throughput volatility variance (</w:t>
+        <w:t>Incorporating live prior-hour error feedback yielded the highest overall holdout fit, explaining 74.83% of passenger throughput volatility variance (</w:t>
       </w:r>
       <m:oMath>
         <m:r>
@@ -5620,13 +5616,13 @@
       <w:pPr>
         <w:pStyle w:val="Heading3"/>
       </w:pPr>
-      <w:bookmarkStart w:id="26" w:name="_Toc242174154"/>
-      <w:bookmarkStart w:id="27" w:name="_Toc242174806"/>
+      <w:bookmarkStart w:id="24" w:name="_Toc242174154"/>
+      <w:bookmarkStart w:id="25" w:name="_Toc242174806"/>
       <w:r>
         <w:t>Empirical Confirmation of Asymmetric Trade-Offs</w:t>
       </w:r>
-      <w:bookmarkEnd w:id="26"/>
-      <w:bookmarkEnd w:id="27"/>
+      <w:bookmarkEnd w:id="24"/>
+      <w:bookmarkEnd w:id="25"/>
     </w:p>
     <w:p>
       <w:pPr>
@@ -5973,7 +5969,7 @@
 
 <file path=word/comments.xml><?xml version="1.0" encoding="utf-8"?>
 <w:comments xmlns:wpc="http://schemas.microsoft.com/office/word/2010/wordprocessingCanvas" xmlns:cx="http://schemas.microsoft.com/office/drawing/2014/chartex" xmlns:cx1="http://schemas.microsoft.com/office/drawing/2015/9/8/chartex" xmlns:cx2="http://schemas.microsoft.com/office/drawing/2015/10/21/chartex" xmlns:cx3="http://schemas.microsoft.com/office/drawing/2016/5/9/chartex" xmlns:cx4="http://schemas.microsoft.com/office/drawing/2016/5/10/chartex" xmlns:cx5="http://schemas.microsoft.com/office/drawing/2016/5/11/chartex" xmlns:cx6="http://schemas.microsoft.com/office/drawing/2016/5/12/chartex" xmlns:cx7="http://schemas.microsoft.com/office/drawing/2016/5/13/chartex" xmlns:cx8="http://schemas.microsoft.com/office/drawing/2016/5/14/chartex" xmlns:mc="http://schemas.openxmlformats.org/markup-compatibility/2006" xmlns:m="http://schemas.openxmlformats.org/officeDocument/2006/math" xmlns:aink="http://schemas.microsoft.com/office/drawing/2016/ink" xmlns:am3d="http://schemas.microsoft.com/office/drawing/2017/model3d" xmlns:oel="http://schemas.microsoft.com/office/2019/extlst" xmlns:r="http://schemas.openxmlformats.org/officeDocument/2006/relationships" xmlns:wp14="http://schemas.microsoft.com/office/word/2010/wordprocessingDrawing" xmlns:wp="http://schemas.openxmlformats.org/drawingml/2006/wordprocessingDrawing" xmlns:wpg="http://schemas.microsoft.com/office/word/2010/wordprocessingGroup" xmlns:wpi="http://schemas.microsoft.com/office/word/2010/wordprocessingInk" xmlns:wps="http://schemas.microsoft.com/office/word/2010/wordprocessingShape" xmlns:o="urn:schemas-microsoft-com:office:office" xmlns:v="urn:schemas-microsoft-com:vml" xmlns:w10="urn:schemas-microsoft-com:office:word" xmlns:w="http://schemas.openxmlformats.org/wordprocessingml/2006/main" xmlns:w14="http://schemas.microsoft.com/office/word/2010/wordml" xmlns:w15="http://schemas.microsoft.com/office/word/2012/wordml" xmlns:w16cex="http://schemas.microsoft.com/office/word/2018/wordml/cex" xmlns:w16cid="http://schemas.microsoft.com/office/word/2016/wordml/cid" xmlns:w16="http://schemas.microsoft.com/office/word/2018/wordml" xmlns:w16sdtdh="http://schemas.microsoft.com/office/word/2020/wordml/sdtdatahash" xmlns:w16sdtfl="http://schemas.microsoft.com/office/word/2024/wordml/sdtformatlock" xmlns:w16se="http://schemas.microsoft.com/office/word/2015/wordml/symex" xmlns:w16du="http://schemas.microsoft.com/office/word/2023/wordml/word16du" xmlns:wne="http://schemas.microsoft.com/office/word/2006/wordml" mc:Ignorable="w14 w15 w16se w16cid w16 w16cex w16sdtdh w16sdtfl w16du wp14">
-  <w:comment w:id="6" w:author="Gleich, Leila" w:date="2026-10-06T16:57:00Z" w:initials="GL">
+  <w:comment w:id="14" w:author="Gleich, Leila" w:date="2026-10-06T17:11:00Z" w:initials="GL">
     <w:p>
       <w:r>
         <w:rPr>
@@ -5986,11 +5982,11 @@
           <w:sz w:val="20"/>
           <w:szCs w:val="20"/>
         </w:rPr>
-        <w:t>Appendix</w:t>
+        <w:t>Reword</w:t>
       </w:r>
     </w:p>
   </w:comment>
-  <w:comment w:id="11" w:author="Gleich, Leila" w:date="2026-10-06T17:08:00Z" w:initials="GL">
+  <w:comment w:id="19" w:author="Gleich, Leila" w:date="2026-10-06T16:32:00Z" w:initials="GL">
     <w:p>
       <w:r>
         <w:rPr>
@@ -6003,11 +5999,11 @@
           <w:sz w:val="20"/>
           <w:szCs w:val="20"/>
         </w:rPr>
-        <w:t>Table</w:t>
+        <w:t>appendix or footnote?</w:t>
       </w:r>
     </w:p>
   </w:comment>
-  <w:comment w:id="16" w:author="Gleich, Leila" w:date="2026-10-06T17:11:00Z" w:initials="GL">
+  <w:comment w:id="20" w:author="Gleich, Leila" w:date="2026-10-06T17:22:00Z" w:initials="GL">
     <w:p>
       <w:r>
         <w:rPr>
@@ -6020,45 +6016,11 @@
           <w:sz w:val="20"/>
           <w:szCs w:val="20"/>
         </w:rPr>
-        <w:t>Reword</w:t>
+        <w:t>Explain what a holdout is</w:t>
       </w:r>
     </w:p>
   </w:comment>
-  <w:comment w:id="21" w:author="Gleich, Leila" w:date="2026-10-06T16:32:00Z" w:initials="GL">
-    <w:p>
-      <w:r>
-        <w:rPr>
-          <w:rStyle w:val="CommentReference"/>
-        </w:rPr>
-        <w:annotationRef/>
-      </w:r>
-      <w:r>
-        <w:rPr>
-          <w:sz w:val="20"/>
-          <w:szCs w:val="20"/>
-        </w:rPr>
-        <w:t>appendix or footnote?</w:t>
-      </w:r>
-    </w:p>
-  </w:comment>
-  <w:comment w:id="22" w:author="Gleich, Leila" w:date="2026-10-06T17:22:00Z" w:initials="GL">
-    <w:p>
-      <w:r>
-        <w:rPr>
-          <w:rStyle w:val="CommentReference"/>
-        </w:rPr>
-        <w:annotationRef/>
-      </w:r>
-      <w:r>
-        <w:rPr>
-          <w:sz w:val="20"/>
-          <w:szCs w:val="20"/>
-        </w:rPr>
-        <w:t>Explain what a holdout is</w:t>
-      </w:r>
-    </w:p>
-  </w:comment>
-  <w:comment w:id="23" w:author="Gleich, Leila" w:date="2026-10-06T17:23:00Z" w:initials="GL">
+  <w:comment w:id="21" w:author="Gleich, Leila" w:date="2026-10-06T17:23:00Z" w:initials="GL">
     <w:p>
       <w:r>
         <w:rPr>
@@ -6080,8 +6042,6 @@
 
 <file path=word/commentsExtended.xml><?xml version="1.0" encoding="utf-8"?>
 <w15:commentsEx xmlns:wpc="http://schemas.microsoft.com/office/word/2010/wordprocessingCanvas" xmlns:cx="http://schemas.microsoft.com/office/drawing/2014/chartex" xmlns:cx1="http://schemas.microsoft.com/office/drawing/2015/9/8/chartex" xmlns:cx2="http://schemas.microsoft.com/office/drawing/2015/10/21/chartex" xmlns:cx3="http://schemas.microsoft.com/office/drawing/2016/5/9/chartex" xmlns:cx4="http://schemas.microsoft.com/office/drawing/2016/5/10/chartex" xmlns:cx5="http://schemas.microsoft.com/office/drawing/2016/5/11/chartex" xmlns:cx6="http://schemas.microsoft.com/office/drawing/2016/5/12/chartex" xmlns:cx7="http://schemas.microsoft.com/office/drawing/2016/5/13/chartex" xmlns:cx8="http://schemas.microsoft.com/office/drawing/2016/5/14/chartex" xmlns:mc="http://schemas.openxmlformats.org/markup-compatibility/2006" xmlns:m="http://schemas.openxmlformats.org/officeDocument/2006/math" xmlns:aink="http://schemas.microsoft.com/office/drawing/2016/ink" xmlns:am3d="http://schemas.microsoft.com/office/drawing/2017/model3d" xmlns:oel="http://schemas.microsoft.com/office/2019/extlst" xmlns:r="http://schemas.openxmlformats.org/officeDocument/2006/relationships" xmlns:wp14="http://schemas.microsoft.com/office/word/2010/wordprocessingDrawing" xmlns:wp="http://schemas.openxmlformats.org/drawingml/2006/wordprocessingDrawing" xmlns:wpg="http://schemas.microsoft.com/office/word/2010/wordprocessingGroup" xmlns:wpi="http://schemas.microsoft.com/office/word/2010/wordprocessingInk" xmlns:wps="http://schemas.microsoft.com/office/word/2010/wordprocessingShape" xmlns:o="urn:schemas-microsoft-com:office:office" xmlns:v="urn:schemas-microsoft-com:vml" xmlns:w10="urn:schemas-microsoft-com:office:word" xmlns:w="http://schemas.openxmlformats.org/wordprocessingml/2006/main" xmlns:w14="http://schemas.microsoft.com/office/word/2010/wordml" xmlns:w15="http://schemas.microsoft.com/office/word/2012/wordml" xmlns:w16cex="http://schemas.microsoft.com/office/word/2018/wordml/cex" xmlns:w16cid="http://schemas.microsoft.com/office/word/2016/wordml/cid" xmlns:w16="http://schemas.microsoft.com/office/word/2018/wordml" xmlns:w16sdtdh="http://schemas.microsoft.com/office/word/2020/wordml/sdtdatahash" xmlns:w16sdtfl="http://schemas.microsoft.com/office/word/2024/wordml/sdtformatlock" xmlns:w16se="http://schemas.microsoft.com/office/word/2015/wordml/symex" xmlns:w16du="http://schemas.microsoft.com/office/word/2023/wordml/word16du" xmlns:wne="http://schemas.microsoft.com/office/word/2006/wordml" mc:Ignorable="w14 w15 w16se w16cid w16 w16cex w16sdtdh w16sdtfl w16du wp14">
-  <w15:commentEx w15:paraId="0CFFE471" w15:done="0"/>
-  <w15:commentEx w15:paraId="54CB7DD2" w15:done="0"/>
   <w15:commentEx w15:paraId="38EF5514" w15:done="0"/>
   <w15:commentEx w15:paraId="763D4259" w15:done="0"/>
   <w15:commentEx w15:paraId="6C03471C" w15:done="0"/>
@@ -6091,8 +6051,6 @@
 
 <file path=word/commentsExtensible.xml><?xml version="1.0" encoding="utf-8"?>
 <w16cex:commentsExtensible xmlns:wpc="http://schemas.microsoft.com/office/word/2010/wordprocessingCanvas" xmlns:cx="http://schemas.microsoft.com/office/drawing/2014/chartex" xmlns:cx1="http://schemas.microsoft.com/office/drawing/2015/9/8/chartex" xmlns:cx2="http://schemas.microsoft.com/office/drawing/2015/10/21/chartex" xmlns:cx3="http://schemas.microsoft.com/office/drawing/2016/5/9/chartex" xmlns:cx4="http://schemas.microsoft.com/office/drawing/2016/5/10/chartex" xmlns:cx5="http://schemas.microsoft.com/office/drawing/2016/5/11/chartex" xmlns:cx6="http://schemas.microsoft.com/office/drawing/2016/5/12/chartex" xmlns:cx7="http://schemas.microsoft.com/office/drawing/2016/5/13/chartex" xmlns:cx8="http://schemas.microsoft.com/office/drawing/2016/5/14/chartex" xmlns:cr="http://schemas.microsoft.com/office/comments/2020/reactions" xmlns:mc="http://schemas.openxmlformats.org/markup-compatibility/2006" xmlns:m="http://schemas.openxmlformats.org/officeDocument/2006/math" xmlns:aink="http://schemas.microsoft.com/office/drawing/2016/ink" xmlns:am3d="http://schemas.microsoft.com/office/drawing/2017/model3d" xmlns:oel="http://schemas.microsoft.com/office/2019/extlst" xmlns:r="http://schemas.openxmlformats.org/officeDocument/2006/relationships" xmlns:wp14="http://schemas.microsoft.com/office/word/2010/wordprocessingDrawing" xmlns:wp="http://schemas.openxmlformats.org/drawingml/2006/wordprocessingDrawing" xmlns:wpg="http://schemas.microsoft.com/office/word/2010/wordprocessingGroup" xmlns:wpi="http://schemas.microsoft.com/office/word/2010/wordprocessingInk" xmlns:wps="http://schemas.microsoft.com/office/word/2010/wordprocessingShape" xmlns:o="urn:schemas-microsoft-com:office:office" xmlns:v="urn:schemas-microsoft-com:vml" xmlns:w10="urn:schemas-microsoft-com:office:word" xmlns:w="http://schemas.openxmlformats.org/wordprocessingml/2006/main" xmlns:w14="http://schemas.microsoft.com/office/word/2010/wordml" xmlns:w15="http://schemas.microsoft.com/office/word/2012/wordml" xmlns:w16cex="http://schemas.microsoft.com/office/word/2018/wordml/cex" xmlns:w16cid="http://schemas.microsoft.com/office/word/2016/wordml/cid" xmlns:w16="http://schemas.microsoft.com/office/word/2018/wordml" xmlns:w16sdtdh="http://schemas.microsoft.com/office/word/2020/wordml/sdtdatahash" xmlns:w16sdtfl="http://schemas.microsoft.com/office/word/2024/wordml/sdtformatlock" xmlns:w16se="http://schemas.microsoft.com/office/word/2015/wordml/symex" xmlns:w16du="http://schemas.microsoft.com/office/word/2023/wordml/word16du" xmlns:wne="http://schemas.microsoft.com/office/word/2006/wordml" mc:Ignorable="w14 w15 w16se w16cid w16 w16cex w16sdtdh w16sdtfl cr w16du wp14">
-  <w16cex:commentExtensible w16cex:durableId="6F5AD68B" w16cex:dateUtc="2026-10-06T23:57:00Z"/>
-  <w16cex:commentExtensible w16cex:durableId="4CB04047" w16cex:dateUtc="2026-10-07T00:08:00Z"/>
   <w16cex:commentExtensible w16cex:durableId="1606ACAE" w16cex:dateUtc="2026-10-07T00:11:00Z"/>
   <w16cex:commentExtensible w16cex:durableId="19A75B7F" w16cex:dateUtc="2026-10-06T23:32:00Z"/>
   <w16cex:commentExtensible w16cex:durableId="0519FBD7" w16cex:dateUtc="2026-10-07T00:22:00Z"/>
@@ -6102,8 +6060,6 @@
 
 <file path=word/commentsIds.xml><?xml version="1.0" encoding="utf-8"?>
 <w16cid:commentsIds xmlns:wpc="http://schemas.microsoft.com/office/word/2010/wordprocessingCanvas" xmlns:cx="http://schemas.microsoft.com/office/drawing/2014/chartex" xmlns:cx1="http://schemas.microsoft.com/office/drawing/2015/9/8/chartex" xmlns:cx2="http://schemas.microsoft.com/office/drawing/2015/10/21/chartex" xmlns:cx3="http://schemas.microsoft.com/office/drawing/2016/5/9/chartex" xmlns:cx4="http://schemas.microsoft.com/office/drawing/2016/5/10/chartex" xmlns:cx5="http://schemas.microsoft.com/office/drawing/2016/5/11/chartex" xmlns:cx6="http://schemas.microsoft.com/office/drawing/2016/5/12/chartex" xmlns:cx7="http://schemas.microsoft.com/office/drawing/2016/5/13/chartex" xmlns:cx8="http://schemas.microsoft.com/office/drawing/2016/5/14/chartex" xmlns:mc="http://schemas.openxmlformats.org/markup-compatibility/2006" xmlns:m="http://schemas.openxmlformats.org/officeDocument/2006/math" xmlns:aink="http://schemas.microsoft.com/office/drawing/2016/ink" xmlns:am3d="http://schemas.microsoft.com/office/drawing/2017/model3d" xmlns:oel="http://schemas.microsoft.com/office/2019/extlst" xmlns:r="http://schemas.openxmlformats.org/officeDocument/2006/relationships" xmlns:wp14="http://schemas.microsoft.com/office/word/2010/wordprocessingDrawing" xmlns:wp="http://schemas.openxmlformats.org/drawingml/2006/wordprocessingDrawing" xmlns:wpg="http://schemas.microsoft.com/office/word/2010/wordprocessingGroup" xmlns:wpi="http://schemas.microsoft.com/office/word/2010/wordprocessingInk" xmlns:wps="http://schemas.microsoft.com/office/word/2010/wordprocessingShape" xmlns:o="urn:schemas-microsoft-com:office:office" xmlns:v="urn:schemas-microsoft-com:vml" xmlns:w10="urn:schemas-microsoft-com:office:word" xmlns:w="http://schemas.openxmlformats.org/wordprocessingml/2006/main" xmlns:w14="http://schemas.microsoft.com/office/word/2010/wordml" xmlns:w15="http://schemas.microsoft.com/office/word/2012/wordml" xmlns:w16cex="http://schemas.microsoft.com/office/word/2018/wordml/cex" xmlns:w16cid="http://schemas.microsoft.com/office/word/2016/wordml/cid" xmlns:w16="http://schemas.microsoft.com/office/word/2018/wordml" xmlns:w16sdtdh="http://schemas.microsoft.com/office/word/2020/wordml/sdtdatahash" xmlns:w16sdtfl="http://schemas.microsoft.com/office/word/2024/wordml/sdtformatlock" xmlns:w16se="http://schemas.microsoft.com/office/word/2015/wordml/symex" xmlns:w16du="http://schemas.microsoft.com/office/word/2023/wordml/word16du" xmlns:wne="http://schemas.microsoft.com/office/word/2006/wordml" mc:Ignorable="w14 w15 w16se w16cid w16 w16cex w16sdtdh w16sdtfl w16du wp14">
-  <w16cid:commentId w16cid:paraId="0CFFE471" w16cid:durableId="6F5AD68B"/>
-  <w16cid:commentId w16cid:paraId="54CB7DD2" w16cid:durableId="4CB04047"/>
   <w16cid:commentId w16cid:paraId="38EF5514" w16cid:durableId="1606ACAE"/>
   <w16cid:commentId w16cid:paraId="763D4259" w16cid:durableId="19A75B7F"/>
   <w16cid:commentId w16cid:paraId="6C03471C" w16cid:durableId="0519FBD7"/>
@@ -8493,6 +8449,7 @@
   <w:style w:type="character" w:default="1" w:styleId="DefaultParagraphFont">
     <w:name w:val="Default Paragraph Font"/>
     <w:uiPriority w:val="1"/>
+    <w:semiHidden/>
     <w:unhideWhenUsed/>
   </w:style>
   <w:style w:type="table" w:default="1" w:styleId="TableNormal">
@@ -9511,7 +9468,7 @@
 </file>
 
 <file path=customXml/itemProps1.xml><?xml version="1.0" encoding="utf-8"?>
-<ds:datastoreItem xmlns:ds="http://schemas.openxmlformats.org/officeDocument/2006/customXml" ds:itemID="{DA27429C-1DF8-4340-B006-863F52FCE9B0}">
+<ds:datastoreItem xmlns:ds="http://schemas.openxmlformats.org/officeDocument/2006/customXml" ds:itemID="{5F7DD602-9FE5-2647-B562-22E7A4C6BAEB}">
   <ds:schemaRefs>
     <ds:schemaRef ds:uri="http://schemas.openxmlformats.org/officeDocument/2006/bibliography"/>
   </ds:schemaRefs>

</xml_diff>